<commit_message>
Update Loofdoes calibration doc for the current menu and units
Documents the previously-undocumented "Edit PWM point" option and the
new analog/pump/GPS/GPS-passthrough diagnostic toggles (incl. the
Serial Plotter output format), and fixes stale l/min-and-litres
examples to match the firmware's actual ml/min-and-millilitres units.

Co-Authored-By: Claude Sonnet 5 <noreply@anthropic.com>
</commit_message>
<xml_diff>
--- a/Loofdoes Spuitcomputer/Documentation/Calibration_Procedure.docx
+++ b/Loofdoes Spuitcomputer/Documentation/Calibration_Procedure.docx
@@ -111,7 +111,7 @@
           </w:tcPr>
           <w:p>
             <w:r>
-              <w:t>Maps the pump PWM control value (0–1 023) to actual pump flow in l/min</w:t>
+              <w:t>Maps the pump PWM control value (0–1 023) to actual pump flow in ml/min</w:t>
             </w:r>
           </w:p>
         </w:tc>
@@ -218,7 +218,7 @@
                 <w:color w:val="A8D8A8"/>
                 <w:sz w:val="18"/>
               </w:rPr>
-              <w:t>1. Analog input  (l/ha)</w:t>
+              <w:t>1. Analog input    (l/ha)</w:t>
             </w:r>
           </w:p>
           <w:p>
@@ -231,7 +231,7 @@
                 <w:color w:val="A8D8A8"/>
                 <w:sz w:val="18"/>
               </w:rPr>
-              <w:t>2. PWM output    (l/min)</w:t>
+              <w:t>2. PWM output      (ml/min)</w:t>
             </w:r>
           </w:p>
           <w:p>
@@ -245,6 +245,71 @@
                 <w:sz w:val="18"/>
               </w:rPr>
               <w:t>3. Show current calibration</w:t>
+            </w:r>
+          </w:p>
+          <w:p>
+            <w:pPr>
+              <w:spacing w:before="0" w:after="0"/>
+            </w:pPr>
+            <w:r>
+              <w:rPr>
+                <w:rFonts w:ascii="Courier New" w:hAnsi="Courier New"/>
+                <w:color w:val="A8D8A8"/>
+                <w:sz w:val="18"/>
+              </w:rPr>
+              <w:t>4. Edit PWM point</w:t>
+            </w:r>
+          </w:p>
+          <w:p>
+            <w:pPr>
+              <w:spacing w:before="0" w:after="0"/>
+            </w:pPr>
+            <w:r>
+              <w:rPr>
+                <w:rFonts w:ascii="Courier New" w:hAnsi="Courier New"/>
+                <w:color w:val="A8D8A8"/>
+                <w:sz w:val="18"/>
+              </w:rPr>
+              <w:t>5. Analog output   (raw/dose/speed/flow) (OFF - press to toggle)</w:t>
+            </w:r>
+          </w:p>
+          <w:p>
+            <w:pPr>
+              <w:spacing w:before="0" w:after="0"/>
+            </w:pPr>
+            <w:r>
+              <w:rPr>
+                <w:rFonts w:ascii="Courier New" w:hAnsi="Courier New"/>
+                <w:color w:val="A8D8A8"/>
+                <w:sz w:val="18"/>
+              </w:rPr>
+              <w:t>6. Pump output     (calMode/pumpBtn/pumpOn/pumpVal) (OFF - press to toggle)</w:t>
+            </w:r>
+          </w:p>
+          <w:p>
+            <w:pPr>
+              <w:spacing w:before="0" w:after="0"/>
+            </w:pPr>
+            <w:r>
+              <w:rPr>
+                <w:rFonts w:ascii="Courier New" w:hAnsi="Courier New"/>
+                <w:color w:val="A8D8A8"/>
+                <w:sz w:val="18"/>
+              </w:rPr>
+              <w:t>7. GPS output      (OFF - press to toggle)</w:t>
+            </w:r>
+          </w:p>
+          <w:p>
+            <w:pPr>
+              <w:spacing w:before="0" w:after="0"/>
+            </w:pPr>
+            <w:r>
+              <w:rPr>
+                <w:rFonts w:ascii="Courier New" w:hAnsi="Courier New"/>
+                <w:color w:val="A8D8A8"/>
+                <w:sz w:val="18"/>
+              </w:rPr>
+              <w:t>8. GPS raw passthrough (OFF - press to toggle)</w:t>
             </w:r>
           </w:p>
           <w:p>
@@ -762,7 +827,7 @@
     </w:p>
     <w:p>
       <w:r>
-        <w:t>This procedure characterises the pump flow curve at five equally-spaced PWM control values. For each point the ESP32 runs the pump for exactly one minute; the volume collected in the bucket equals the flow in l/min.</w:t>
+        <w:t>This procedure characterises the pump flow curve at five equally-spaced PWM control values. For each point the ESP32 runs the pump for exactly one minute; the volume collected in the bucket equals the flow in ml/min.</w:t>
       </w:r>
     </w:p>
     <w:p>
@@ -1032,7 +1097,7 @@
     </w:p>
     <w:p>
       <w:r>
-        <w:t>The ESP32 now steps through the five PWM values one by one. For each point: place the bucket under the outlet and press Enter. The pump runs for exactly 60 seconds with a live countdown, then stops automatically. Measure the collected volume and enter it — the value is the flow in l/min.</w:t>
+        <w:t>The ESP32 now steps through the five PWM values one by one. For each point: place the bucket under the outlet and press Enter. The pump runs for exactly 60 seconds with a live countdown, then stops automatically. Measure the collected volume and enter it — the value is the flow in ml/min.</w:t>
       </w:r>
     </w:p>
     <w:tbl>
@@ -1151,7 +1216,7 @@
                 <w:color w:val="A8D8A8"/>
                 <w:sz w:val="18"/>
               </w:rPr>
-              <w:t>Run complete. Enter volume collected (l): 0.85</w:t>
+              <w:t>Run complete. Enter volume collected (ml): 850</w:t>
             </w:r>
           </w:p>
           <w:p>
@@ -1164,7 +1229,7 @@
                 <w:color w:val="A8D8A8"/>
                 <w:sz w:val="18"/>
               </w:rPr>
-              <w:t>Saved: PWM=342, flow=0.85 l/min.</w:t>
+              <w:t>Saved: PWM=342, flow=850 ml/min.</w:t>
             </w:r>
           </w:p>
           <w:p>
@@ -1242,7 +1307,7 @@
                 <w:color w:val="A8D8A8"/>
                 <w:sz w:val="18"/>
               </w:rPr>
-              <w:t>Run complete. Enter volume collected (l): 1.20</w:t>
+              <w:t>Run complete. Enter volume collected (ml): 1200</w:t>
             </w:r>
           </w:p>
           <w:p>
@@ -1255,7 +1320,7 @@
                 <w:color w:val="A8D8A8"/>
                 <w:sz w:val="18"/>
               </w:rPr>
-              <w:t>Saved: PWM=512, flow=1.20 l/min.</w:t>
+              <w:t>Saved: PWM=512, flow=1200 ml/min.</w:t>
             </w:r>
           </w:p>
           <w:p>
@@ -1333,7 +1398,7 @@
                 <w:color w:val="A8D8A8"/>
                 <w:sz w:val="18"/>
               </w:rPr>
-              <w:t>Run complete. Enter volume collected (l): 1.55</w:t>
+              <w:t>Run complete. Enter volume collected (ml): 1550</w:t>
             </w:r>
           </w:p>
           <w:p>
@@ -1346,7 +1411,7 @@
                 <w:color w:val="A8D8A8"/>
                 <w:sz w:val="18"/>
               </w:rPr>
-              <w:t>Saved: PWM=682, flow=1.55 l/min.</w:t>
+              <w:t>Saved: PWM=682, flow=1550 ml/min.</w:t>
             </w:r>
           </w:p>
           <w:p>
@@ -1424,7 +1489,7 @@
                 <w:color w:val="A8D8A8"/>
                 <w:sz w:val="18"/>
               </w:rPr>
-              <w:t>Run complete. Enter volume collected (l): 1.82</w:t>
+              <w:t>Run complete. Enter volume collected (ml): 1820</w:t>
             </w:r>
           </w:p>
           <w:p>
@@ -1437,7 +1502,7 @@
                 <w:color w:val="A8D8A8"/>
                 <w:sz w:val="18"/>
               </w:rPr>
-              <w:t>Saved: PWM=852, flow=1.82 l/min.</w:t>
+              <w:t>Saved: PWM=852, flow=1820 ml/min.</w:t>
             </w:r>
           </w:p>
           <w:p>
@@ -1515,7 +1580,7 @@
                 <w:color w:val="A8D8A8"/>
                 <w:sz w:val="18"/>
               </w:rPr>
-              <w:t>Run complete. Enter volume collected (l): 2.10</w:t>
+              <w:t>Run complete. Enter volume collected (ml): 2100</w:t>
             </w:r>
           </w:p>
           <w:p>
@@ -1528,7 +1593,7 @@
                 <w:color w:val="A8D8A8"/>
                 <w:sz w:val="18"/>
               </w:rPr>
-              <w:t>Saved: PWM=1023, flow=2.10 l/min.</w:t>
+              <w:t>Saved: PWM=1023, flow=2100 ml/min.</w:t>
             </w:r>
           </w:p>
           <w:p>
@@ -1586,7 +1651,346 @@
         <w:pStyle w:val="Heading1"/>
       </w:pPr>
       <w:r>
-        <w:t>6.  Verifying the Calibration</w:t>
+        <w:t>6.  Editing a PWM Point</w:t>
+      </w:r>
+    </w:p>
+    <w:p>
+      <w:r>
+        <w:t>Use this option to correct a single PWM calibration point (for example, a bad bucket reading) without repeating the entire five-point PWM run. The corrected value is written to NVS immediately.</w:t>
+      </w:r>
+    </w:p>
+    <w:p>
+      <w:pPr>
+        <w:pStyle w:val="ListNumber"/>
+      </w:pPr>
+      <w:r>
+        <w:t>Type 4 and press Enter.</w:t>
+      </w:r>
+    </w:p>
+    <w:p/>
+    <w:tbl>
+      <w:tblPr>
+        <w:tblStyle w:val="TableGrid"/>
+        <w:tblW w:type="auto" w:w="0"/>
+        <w:tblLook w:firstColumn="1" w:firstRow="1" w:lastColumn="0" w:lastRow="0" w:noHBand="0" w:noVBand="1" w:val="04A0"/>
+      </w:tblPr>
+      <w:tblGrid>
+        <w:gridCol w:w="9122"/>
+      </w:tblGrid>
+      <w:tr>
+        <w:tc>
+          <w:tcPr>
+            <w:tcW w:type="dxa" w:w="9122"/>
+            <w:shd w:val="clear" w:color="auto" w:fill="1E1E1E"/>
+          </w:tcPr>
+          <w:p>
+            <w:pPr>
+              <w:spacing w:before="0" w:after="0"/>
+            </w:pPr>
+            <w:r>
+              <w:rPr>
+                <w:rFonts w:ascii="Courier New" w:hAnsi="Courier New"/>
+                <w:color w:val="A8D8A8"/>
+                <w:sz w:val="18"/>
+              </w:rPr>
+              <w:t>=== CURRENT CALIBRATION ===</w:t>
+            </w:r>
+          </w:p>
+          <w:p>
+            <w:pPr>
+              <w:spacing w:before="0" w:after="0"/>
+            </w:pPr>
+            <w:r>
+              <w:rPr>
+                <w:rFonts w:ascii="Courier New" w:hAnsi="Courier New"/>
+                <w:color w:val="A8D8A8"/>
+                <w:sz w:val="18"/>
+              </w:rPr>
+              <w:t>...</w:t>
+            </w:r>
+          </w:p>
+          <w:p>
+            <w:pPr>
+              <w:spacing w:before="0" w:after="0"/>
+            </w:pPr>
+            <w:r>
+              <w:rPr>
+                <w:rFonts w:ascii="Courier New" w:hAnsi="Courier New"/>
+                <w:color w:val="A8D8A8"/>
+                <w:sz w:val="18"/>
+              </w:rPr>
+              <w:t>Select PWM point to edit (1-5, q to cancel): _</w:t>
+            </w:r>
+          </w:p>
+        </w:tc>
+      </w:tr>
+    </w:tbl>
+    <w:p/>
+    <w:p>
+      <w:pPr>
+        <w:pStyle w:val="ListNumber"/>
+      </w:pPr>
+      <w:r>
+        <w:t>Enter the number of the point to edit and press Enter. The current PWM and flow for that point are shown, then enter the corrected flow:</w:t>
+      </w:r>
+    </w:p>
+    <w:p/>
+    <w:tbl>
+      <w:tblPr>
+        <w:tblStyle w:val="TableGrid"/>
+        <w:tblW w:type="auto" w:w="0"/>
+        <w:tblLook w:firstColumn="1" w:firstRow="1" w:lastColumn="0" w:lastRow="0" w:noHBand="0" w:noVBand="1" w:val="04A0"/>
+      </w:tblPr>
+      <w:tblGrid>
+        <w:gridCol w:w="9122"/>
+      </w:tblGrid>
+      <w:tr>
+        <w:tc>
+          <w:tcPr>
+            <w:tcW w:type="dxa" w:w="9122"/>
+            <w:shd w:val="clear" w:color="auto" w:fill="1E1E1E"/>
+          </w:tcPr>
+          <w:p>
+            <w:pPr>
+              <w:spacing w:before="0" w:after="0"/>
+            </w:pPr>
+            <w:r>
+              <w:rPr>
+                <w:rFonts w:ascii="Courier New" w:hAnsi="Courier New"/>
+                <w:color w:val="A8D8A8"/>
+                <w:sz w:val="18"/>
+              </w:rPr>
+              <w:t>Point 3: PWM=682, flow=1550 ml/min</w:t>
+            </w:r>
+          </w:p>
+          <w:p>
+            <w:pPr>
+              <w:spacing w:before="0" w:after="0"/>
+            </w:pPr>
+            <w:r>
+              <w:rPr>
+                <w:rFonts w:ascii="Courier New" w:hAnsi="Courier New"/>
+                <w:color w:val="A8D8A8"/>
+                <w:sz w:val="18"/>
+              </w:rPr>
+              <w:t>New flow (1-4000 ml/min, q to cancel): 1600</w:t>
+            </w:r>
+          </w:p>
+          <w:p>
+            <w:pPr>
+              <w:spacing w:before="0" w:after="0"/>
+            </w:pPr>
+            <w:r>
+              <w:rPr>
+                <w:rFonts w:ascii="Courier New" w:hAnsi="Courier New"/>
+                <w:color w:val="A8D8A8"/>
+                <w:sz w:val="18"/>
+              </w:rPr>
+              <w:t>Saved.</w:t>
+            </w:r>
+          </w:p>
+        </w:tc>
+      </w:tr>
+    </w:tbl>
+    <w:p/>
+    <w:p>
+      <w:pPr>
+        <w:ind w:left="432"/>
+      </w:pPr>
+      <w:r>
+        <w:rPr>
+          <w:b/>
+          <w:color w:val="196FC4"/>
+        </w:rPr>
+        <w:t xml:space="preserve">⚠️  Note: </w:t>
+      </w:r>
+      <w:r>
+        <w:rPr>
+          <w:i/>
+          <w:color w:val="404040"/>
+        </w:rPr>
+        <w:t>Enter q instead of a point number, or instead of a flow value, at any point to cancel and return to the menu without changing anything.</w:t>
+      </w:r>
+    </w:p>
+    <w:p/>
+    <w:p>
+      <w:pPr>
+        <w:pStyle w:val="Heading1"/>
+      </w:pPr>
+      <w:r>
+        <w:t>7.  Live Diagnostic Output</w:t>
+      </w:r>
+    </w:p>
+    <w:p>
+      <w:r>
+        <w:t>Options 5–8 each toggle a separate live telemetry stream on or off independently. Enabled streams print automatically, once every 500 ms, whenever the calibration menu is idle (i.e. not in the middle of a calibration step) — no further input is needed once a stream is switched on.</w:t>
+      </w:r>
+    </w:p>
+    <w:p>
+      <w:pPr>
+        <w:pStyle w:val="Heading2"/>
+      </w:pPr>
+      <w:r>
+        <w:t>7.1  Analog Output (Serial Plotter)</w:t>
+      </w:r>
+    </w:p>
+    <w:p>
+      <w:r>
+        <w:t>Type 5 and press Enter to toggle. Prints the raw analog reading, the interpolated dose, current GPS ground speed, and the resulting pump flow demand, formatted as Arduino Serial Plotter label:value pairs:</w:t>
+      </w:r>
+    </w:p>
+    <w:tbl>
+      <w:tblPr>
+        <w:tblStyle w:val="TableGrid"/>
+        <w:tblW w:type="auto" w:w="0"/>
+        <w:tblLook w:firstColumn="1" w:firstRow="1" w:lastColumn="0" w:lastRow="0" w:noHBand="0" w:noVBand="1" w:val="04A0"/>
+      </w:tblPr>
+      <w:tblGrid>
+        <w:gridCol w:w="9122"/>
+      </w:tblGrid>
+      <w:tr>
+        <w:tc>
+          <w:tcPr>
+            <w:tcW w:type="dxa" w:w="9122"/>
+            <w:shd w:val="clear" w:color="auto" w:fill="1E1E1E"/>
+          </w:tcPr>
+          <w:p>
+            <w:pPr>
+              <w:spacing w:before="0" w:after="0"/>
+            </w:pPr>
+            <w:r>
+              <w:rPr>
+                <w:rFonts w:ascii="Courier New" w:hAnsi="Courier New"/>
+                <w:color w:val="A8D8A8"/>
+                <w:sz w:val="18"/>
+              </w:rPr>
+              <w:t>raw:2031,dose:100.0,speed:1.85,flow:1550.0</w:t>
+            </w:r>
+          </w:p>
+        </w:tc>
+      </w:tr>
+    </w:tbl>
+    <w:p/>
+    <w:p>
+      <w:r>
+        <w:t>Open Tools ▸ Serial Plotter in the Arduino IDE (or the equivalent view in PlatformIO) at 115 200 baud to graph these four values live while turning the knob or driving — useful for sanity-checking the dose curve in the field without redoing the full calibration.</w:t>
+      </w:r>
+    </w:p>
+    <w:p>
+      <w:pPr>
+        <w:pStyle w:val="Heading2"/>
+      </w:pPr>
+      <w:r>
+        <w:t>7.2  Pump Output</w:t>
+      </w:r>
+    </w:p>
+    <w:p>
+      <w:r>
+        <w:t>Type 6 and press Enter to toggle. Prints calibration-mode state, the pump button state, whether the pump output is currently on, whether it’s being PWM-driven, and the raw value sent to the pump:</w:t>
+      </w:r>
+    </w:p>
+    <w:tbl>
+      <w:tblPr>
+        <w:tblStyle w:val="TableGrid"/>
+        <w:tblW w:type="auto" w:w="0"/>
+        <w:tblLook w:firstColumn="1" w:firstRow="1" w:lastColumn="0" w:lastRow="0" w:noHBand="0" w:noVBand="1" w:val="04A0"/>
+      </w:tblPr>
+      <w:tblGrid>
+        <w:gridCol w:w="9122"/>
+      </w:tblGrid>
+      <w:tr>
+        <w:tc>
+          <w:tcPr>
+            <w:tcW w:type="dxa" w:w="9122"/>
+            <w:shd w:val="clear" w:color="auto" w:fill="1E1E1E"/>
+          </w:tcPr>
+          <w:p>
+            <w:pPr>
+              <w:spacing w:before="0" w:after="0"/>
+            </w:pPr>
+            <w:r>
+              <w:rPr>
+                <w:rFonts w:ascii="Courier New" w:hAnsi="Courier New"/>
+                <w:color w:val="A8D8A8"/>
+                <w:sz w:val="18"/>
+              </w:rPr>
+              <w:t>calMode=N  pumpBtn=0  pumpOn=1  pumpPwmFlag=1  pumpVal=682</w:t>
+            </w:r>
+          </w:p>
+        </w:tc>
+      </w:tr>
+    </w:tbl>
+    <w:p/>
+    <w:p>
+      <w:r>
+        <w:t>Not formatted for the Serial Plotter — these are mostly discrete on/off flags, more useful read as text than graphed.</w:t>
+      </w:r>
+    </w:p>
+    <w:p>
+      <w:pPr>
+        <w:pStyle w:val="Heading2"/>
+      </w:pPr>
+      <w:r>
+        <w:t>7.3  GPS Output</w:t>
+      </w:r>
+    </w:p>
+    <w:p>
+      <w:r>
+        <w:t>Type 7 and press Enter to toggle. Prints ground speed, position, and the NMEA GGA fix-quality indicator (0 = no fix, 1 = GPS fix, 2 = DGPS fix, etc.):</w:t>
+      </w:r>
+    </w:p>
+    <w:tbl>
+      <w:tblPr>
+        <w:tblStyle w:val="TableGrid"/>
+        <w:tblW w:type="auto" w:w="0"/>
+        <w:tblLook w:firstColumn="1" w:firstRow="1" w:lastColumn="0" w:lastRow="0" w:noHBand="0" w:noVBand="1" w:val="04A0"/>
+      </w:tblPr>
+      <w:tblGrid>
+        <w:gridCol w:w="9122"/>
+      </w:tblGrid>
+      <w:tr>
+        <w:tc>
+          <w:tcPr>
+            <w:tcW w:type="dxa" w:w="9122"/>
+            <w:shd w:val="clear" w:color="auto" w:fill="1E1E1E"/>
+          </w:tcPr>
+          <w:p>
+            <w:pPr>
+              <w:spacing w:before="0" w:after="0"/>
+            </w:pPr>
+            <w:r>
+              <w:rPr>
+                <w:rFonts w:ascii="Courier New" w:hAnsi="Courier New"/>
+                <w:color w:val="A8D8A8"/>
+                <w:sz w:val="18"/>
+              </w:rPr>
+              <w:t>GPS: speed=1.85 m/s  lat=52.123456  lon=5.123456  quality=1</w:t>
+            </w:r>
+          </w:p>
+        </w:tc>
+      </w:tr>
+    </w:tbl>
+    <w:p/>
+    <w:p>
+      <w:pPr>
+        <w:pStyle w:val="Heading2"/>
+      </w:pPr>
+      <w:r>
+        <w:t>7.4  GPS Raw Passthrough</w:t>
+      </w:r>
+    </w:p>
+    <w:p>
+      <w:r>
+        <w:t>Type 8 and press Enter to toggle. Echoes the raw NMEA sentences received from the GPS receiver directly to the serial monitor — for low-level debugging of the GPS link itself, independent of the parsed output above.</w:t>
+      </w:r>
+    </w:p>
+    <w:p/>
+    <w:p>
+      <w:pPr>
+        <w:pStyle w:val="Heading1"/>
+      </w:pPr>
+      <w:r>
+        <w:t>8.  Verifying the Calibration</w:t>
       </w:r>
     </w:p>
     <w:p>
@@ -1697,7 +2101,7 @@
                 <w:color w:val="A8D8A8"/>
                 <w:sz w:val="18"/>
               </w:rPr>
-              <w:t xml:space="preserve">  1: pwm=342   flow=0.85 l/min</w:t>
+              <w:t xml:space="preserve">  1: pwm=342   flow=850 ml/min</w:t>
             </w:r>
           </w:p>
           <w:p>
@@ -1710,7 +2114,7 @@
                 <w:color w:val="A8D8A8"/>
                 <w:sz w:val="18"/>
               </w:rPr>
-              <w:t xml:space="preserve">  2: pwm=512   flow=1.20 l/min</w:t>
+              <w:t xml:space="preserve">  2: pwm=512   flow=1200 ml/min</w:t>
             </w:r>
           </w:p>
           <w:p>
@@ -1723,7 +2127,7 @@
                 <w:color w:val="A8D8A8"/>
                 <w:sz w:val="18"/>
               </w:rPr>
-              <w:t xml:space="preserve">  3: pwm=682   flow=1.55 l/min</w:t>
+              <w:t xml:space="preserve">  3: pwm=682   flow=1550 ml/min</w:t>
             </w:r>
           </w:p>
           <w:p>
@@ -1736,7 +2140,7 @@
                 <w:color w:val="A8D8A8"/>
                 <w:sz w:val="18"/>
               </w:rPr>
-              <w:t xml:space="preserve">  4: pwm=852   flow=1.82 l/min</w:t>
+              <w:t xml:space="preserve">  4: pwm=852   flow=1820 ml/min</w:t>
             </w:r>
           </w:p>
           <w:p>
@@ -1749,7 +2153,7 @@
                 <w:color w:val="A8D8A8"/>
                 <w:sz w:val="18"/>
               </w:rPr>
-              <w:t xml:space="preserve">  5: pwm=1023  flow=2.10 l/min</w:t>
+              <w:t xml:space="preserve">  5: pwm=1023  flow=2100 ml/min</w:t>
             </w:r>
           </w:p>
         </w:tc>
@@ -1767,7 +2171,7 @@
         <w:pStyle w:val="Heading1"/>
       </w:pPr>
       <w:r>
-        <w:t>7.  Exiting Calibration</w:t>
+        <w:t>9.  Exiting Calibration</w:t>
       </w:r>
     </w:p>
     <w:p>

</xml_diff>

<commit_message>
Add Pootmachinebesturing, distilled from the legacy Ploeg-Poot combo sketch
Restructures the planter half of the old combined Ploeg_Poot_2026.ino into
the standard src/lib/test PlatformIO layout, mirroring Ploegbesturing's own
migration: ImplementPlanter/InterfacePlanter/CalibrationPlanter split,
namespace triton, PascalCase methods, own ACAN_T4 CAN/ISOBUS setup in
main.cpp. Fixes several real bugs along the way (uninitialized timers/flags,
calibration interpolation divide-by-zero, EEPROM range validation, an
out-of-bounds history-array read, a language file that wouldn't compile under
ENGLISH). 30/30 native AUnit tests pass and a real teensy41 build succeeds.

Co-Authored-By: Claude Sonnet 5 <noreply@anthropic.com>
</commit_message>
<xml_diff>
--- a/Loofdoes Spuitcomputer/Documentation/Calibration_Procedure.docx
+++ b/Loofdoes Spuitcomputer/Documentation/Calibration_Procedure.docx
@@ -111,7 +111,7 @@
           </w:tcPr>
           <w:p>
             <w:r>
-              <w:t>Maps the pump PWM control value (0–1 023) to actual pump flow in ml/min</w:t>
+              <w:t>Maps the pump PWM control value (0–1 023) to actual pump flow in l/min</w:t>
             </w:r>
           </w:p>
         </w:tc>
@@ -218,7 +218,7 @@
                 <w:color w:val="A8D8A8"/>
                 <w:sz w:val="18"/>
               </w:rPr>
-              <w:t>1. Analog input    (l/ha)</w:t>
+              <w:t>1. Analog input  (l/ha)</w:t>
             </w:r>
           </w:p>
           <w:p>
@@ -231,7 +231,7 @@
                 <w:color w:val="A8D8A8"/>
                 <w:sz w:val="18"/>
               </w:rPr>
-              <w:t>2. PWM output      (ml/min)</w:t>
+              <w:t>2. PWM output    (l/min)</w:t>
             </w:r>
           </w:p>
           <w:p>
@@ -245,71 +245,6 @@
                 <w:sz w:val="18"/>
               </w:rPr>
               <w:t>3. Show current calibration</w:t>
-            </w:r>
-          </w:p>
-          <w:p>
-            <w:pPr>
-              <w:spacing w:before="0" w:after="0"/>
-            </w:pPr>
-            <w:r>
-              <w:rPr>
-                <w:rFonts w:ascii="Courier New" w:hAnsi="Courier New"/>
-                <w:color w:val="A8D8A8"/>
-                <w:sz w:val="18"/>
-              </w:rPr>
-              <w:t>4. Edit PWM point</w:t>
-            </w:r>
-          </w:p>
-          <w:p>
-            <w:pPr>
-              <w:spacing w:before="0" w:after="0"/>
-            </w:pPr>
-            <w:r>
-              <w:rPr>
-                <w:rFonts w:ascii="Courier New" w:hAnsi="Courier New"/>
-                <w:color w:val="A8D8A8"/>
-                <w:sz w:val="18"/>
-              </w:rPr>
-              <w:t>5. Analog output   (raw/dose/speed/flow) (OFF - press to toggle)</w:t>
-            </w:r>
-          </w:p>
-          <w:p>
-            <w:pPr>
-              <w:spacing w:before="0" w:after="0"/>
-            </w:pPr>
-            <w:r>
-              <w:rPr>
-                <w:rFonts w:ascii="Courier New" w:hAnsi="Courier New"/>
-                <w:color w:val="A8D8A8"/>
-                <w:sz w:val="18"/>
-              </w:rPr>
-              <w:t>6. Pump output     (calMode/pumpBtn/pumpOn/pumpVal) (OFF - press to toggle)</w:t>
-            </w:r>
-          </w:p>
-          <w:p>
-            <w:pPr>
-              <w:spacing w:before="0" w:after="0"/>
-            </w:pPr>
-            <w:r>
-              <w:rPr>
-                <w:rFonts w:ascii="Courier New" w:hAnsi="Courier New"/>
-                <w:color w:val="A8D8A8"/>
-                <w:sz w:val="18"/>
-              </w:rPr>
-              <w:t>7. GPS output      (OFF - press to toggle)</w:t>
-            </w:r>
-          </w:p>
-          <w:p>
-            <w:pPr>
-              <w:spacing w:before="0" w:after="0"/>
-            </w:pPr>
-            <w:r>
-              <w:rPr>
-                <w:rFonts w:ascii="Courier New" w:hAnsi="Courier New"/>
-                <w:color w:val="A8D8A8"/>
-                <w:sz w:val="18"/>
-              </w:rPr>
-              <w:t>8. GPS raw passthrough (OFF - press to toggle)</w:t>
             </w:r>
           </w:p>
           <w:p>
@@ -827,7 +762,7 @@
     </w:p>
     <w:p>
       <w:r>
-        <w:t>This procedure characterises the pump flow curve at five equally-spaced PWM control values. For each point the ESP32 runs the pump for exactly one minute; the volume collected in the bucket equals the flow in ml/min.</w:t>
+        <w:t>This procedure characterises the pump flow curve at five equally-spaced PWM control values. For each point the ESP32 runs the pump for exactly one minute; the volume collected in the bucket equals the flow in l/min.</w:t>
       </w:r>
     </w:p>
     <w:p>
@@ -1097,7 +1032,7 @@
     </w:p>
     <w:p>
       <w:r>
-        <w:t>The ESP32 now steps through the five PWM values one by one. For each point: place the bucket under the outlet and press Enter. The pump runs for exactly 60 seconds with a live countdown, then stops automatically. Measure the collected volume and enter it — the value is the flow in ml/min.</w:t>
+        <w:t>The ESP32 now steps through the five PWM values one by one. For each point: place the bucket under the outlet and press Enter. The pump runs for exactly 60 seconds with a live countdown, then stops automatically. Measure the collected volume and enter it — the value is the flow in l/min.</w:t>
       </w:r>
     </w:p>
     <w:tbl>
@@ -1216,7 +1151,7 @@
                 <w:color w:val="A8D8A8"/>
                 <w:sz w:val="18"/>
               </w:rPr>
-              <w:t>Run complete. Enter volume collected (ml): 850</w:t>
+              <w:t>Run complete. Enter volume collected (l): 0.85</w:t>
             </w:r>
           </w:p>
           <w:p>
@@ -1229,7 +1164,7 @@
                 <w:color w:val="A8D8A8"/>
                 <w:sz w:val="18"/>
               </w:rPr>
-              <w:t>Saved: PWM=342, flow=850 ml/min.</w:t>
+              <w:t>Saved: PWM=342, flow=0.85 l/min.</w:t>
             </w:r>
           </w:p>
           <w:p>
@@ -1307,7 +1242,7 @@
                 <w:color w:val="A8D8A8"/>
                 <w:sz w:val="18"/>
               </w:rPr>
-              <w:t>Run complete. Enter volume collected (ml): 1200</w:t>
+              <w:t>Run complete. Enter volume collected (l): 1.20</w:t>
             </w:r>
           </w:p>
           <w:p>
@@ -1320,7 +1255,7 @@
                 <w:color w:val="A8D8A8"/>
                 <w:sz w:val="18"/>
               </w:rPr>
-              <w:t>Saved: PWM=512, flow=1200 ml/min.</w:t>
+              <w:t>Saved: PWM=512, flow=1.20 l/min.</w:t>
             </w:r>
           </w:p>
           <w:p>
@@ -1398,7 +1333,7 @@
                 <w:color w:val="A8D8A8"/>
                 <w:sz w:val="18"/>
               </w:rPr>
-              <w:t>Run complete. Enter volume collected (ml): 1550</w:t>
+              <w:t>Run complete. Enter volume collected (l): 1.55</w:t>
             </w:r>
           </w:p>
           <w:p>
@@ -1411,7 +1346,7 @@
                 <w:color w:val="A8D8A8"/>
                 <w:sz w:val="18"/>
               </w:rPr>
-              <w:t>Saved: PWM=682, flow=1550 ml/min.</w:t>
+              <w:t>Saved: PWM=682, flow=1.55 l/min.</w:t>
             </w:r>
           </w:p>
           <w:p>
@@ -1489,7 +1424,7 @@
                 <w:color w:val="A8D8A8"/>
                 <w:sz w:val="18"/>
               </w:rPr>
-              <w:t>Run complete. Enter volume collected (ml): 1820</w:t>
+              <w:t>Run complete. Enter volume collected (l): 1.82</w:t>
             </w:r>
           </w:p>
           <w:p>
@@ -1502,7 +1437,7 @@
                 <w:color w:val="A8D8A8"/>
                 <w:sz w:val="18"/>
               </w:rPr>
-              <w:t>Saved: PWM=852, flow=1820 ml/min.</w:t>
+              <w:t>Saved: PWM=852, flow=1.82 l/min.</w:t>
             </w:r>
           </w:p>
           <w:p>
@@ -1580,7 +1515,7 @@
                 <w:color w:val="A8D8A8"/>
                 <w:sz w:val="18"/>
               </w:rPr>
-              <w:t>Run complete. Enter volume collected (ml): 2100</w:t>
+              <w:t>Run complete. Enter volume collected (l): 2.10</w:t>
             </w:r>
           </w:p>
           <w:p>
@@ -1593,7 +1528,7 @@
                 <w:color w:val="A8D8A8"/>
                 <w:sz w:val="18"/>
               </w:rPr>
-              <w:t>Saved: PWM=1023, flow=2100 ml/min.</w:t>
+              <w:t>Saved: PWM=1023, flow=2.10 l/min.</w:t>
             </w:r>
           </w:p>
           <w:p>
@@ -1651,346 +1586,7 @@
         <w:pStyle w:val="Heading1"/>
       </w:pPr>
       <w:r>
-        <w:t>6.  Editing a PWM Point</w:t>
-      </w:r>
-    </w:p>
-    <w:p>
-      <w:r>
-        <w:t>Use this option to correct a single PWM calibration point (for example, a bad bucket reading) without repeating the entire five-point PWM run. The corrected value is written to NVS immediately.</w:t>
-      </w:r>
-    </w:p>
-    <w:p>
-      <w:pPr>
-        <w:pStyle w:val="ListNumber"/>
-      </w:pPr>
-      <w:r>
-        <w:t>Type 4 and press Enter.</w:t>
-      </w:r>
-    </w:p>
-    <w:p/>
-    <w:tbl>
-      <w:tblPr>
-        <w:tblStyle w:val="TableGrid"/>
-        <w:tblW w:type="auto" w:w="0"/>
-        <w:tblLook w:firstColumn="1" w:firstRow="1" w:lastColumn="0" w:lastRow="0" w:noHBand="0" w:noVBand="1" w:val="04A0"/>
-      </w:tblPr>
-      <w:tblGrid>
-        <w:gridCol w:w="9122"/>
-      </w:tblGrid>
-      <w:tr>
-        <w:tc>
-          <w:tcPr>
-            <w:tcW w:type="dxa" w:w="9122"/>
-            <w:shd w:val="clear" w:color="auto" w:fill="1E1E1E"/>
-          </w:tcPr>
-          <w:p>
-            <w:pPr>
-              <w:spacing w:before="0" w:after="0"/>
-            </w:pPr>
-            <w:r>
-              <w:rPr>
-                <w:rFonts w:ascii="Courier New" w:hAnsi="Courier New"/>
-                <w:color w:val="A8D8A8"/>
-                <w:sz w:val="18"/>
-              </w:rPr>
-              <w:t>=== CURRENT CALIBRATION ===</w:t>
-            </w:r>
-          </w:p>
-          <w:p>
-            <w:pPr>
-              <w:spacing w:before="0" w:after="0"/>
-            </w:pPr>
-            <w:r>
-              <w:rPr>
-                <w:rFonts w:ascii="Courier New" w:hAnsi="Courier New"/>
-                <w:color w:val="A8D8A8"/>
-                <w:sz w:val="18"/>
-              </w:rPr>
-              <w:t>...</w:t>
-            </w:r>
-          </w:p>
-          <w:p>
-            <w:pPr>
-              <w:spacing w:before="0" w:after="0"/>
-            </w:pPr>
-            <w:r>
-              <w:rPr>
-                <w:rFonts w:ascii="Courier New" w:hAnsi="Courier New"/>
-                <w:color w:val="A8D8A8"/>
-                <w:sz w:val="18"/>
-              </w:rPr>
-              <w:t>Select PWM point to edit (1-5, q to cancel): _</w:t>
-            </w:r>
-          </w:p>
-        </w:tc>
-      </w:tr>
-    </w:tbl>
-    <w:p/>
-    <w:p>
-      <w:pPr>
-        <w:pStyle w:val="ListNumber"/>
-      </w:pPr>
-      <w:r>
-        <w:t>Enter the number of the point to edit and press Enter. The current PWM and flow for that point are shown, then enter the corrected flow:</w:t>
-      </w:r>
-    </w:p>
-    <w:p/>
-    <w:tbl>
-      <w:tblPr>
-        <w:tblStyle w:val="TableGrid"/>
-        <w:tblW w:type="auto" w:w="0"/>
-        <w:tblLook w:firstColumn="1" w:firstRow="1" w:lastColumn="0" w:lastRow="0" w:noHBand="0" w:noVBand="1" w:val="04A0"/>
-      </w:tblPr>
-      <w:tblGrid>
-        <w:gridCol w:w="9122"/>
-      </w:tblGrid>
-      <w:tr>
-        <w:tc>
-          <w:tcPr>
-            <w:tcW w:type="dxa" w:w="9122"/>
-            <w:shd w:val="clear" w:color="auto" w:fill="1E1E1E"/>
-          </w:tcPr>
-          <w:p>
-            <w:pPr>
-              <w:spacing w:before="0" w:after="0"/>
-            </w:pPr>
-            <w:r>
-              <w:rPr>
-                <w:rFonts w:ascii="Courier New" w:hAnsi="Courier New"/>
-                <w:color w:val="A8D8A8"/>
-                <w:sz w:val="18"/>
-              </w:rPr>
-              <w:t>Point 3: PWM=682, flow=1550 ml/min</w:t>
-            </w:r>
-          </w:p>
-          <w:p>
-            <w:pPr>
-              <w:spacing w:before="0" w:after="0"/>
-            </w:pPr>
-            <w:r>
-              <w:rPr>
-                <w:rFonts w:ascii="Courier New" w:hAnsi="Courier New"/>
-                <w:color w:val="A8D8A8"/>
-                <w:sz w:val="18"/>
-              </w:rPr>
-              <w:t>New flow (1-4000 ml/min, q to cancel): 1600</w:t>
-            </w:r>
-          </w:p>
-          <w:p>
-            <w:pPr>
-              <w:spacing w:before="0" w:after="0"/>
-            </w:pPr>
-            <w:r>
-              <w:rPr>
-                <w:rFonts w:ascii="Courier New" w:hAnsi="Courier New"/>
-                <w:color w:val="A8D8A8"/>
-                <w:sz w:val="18"/>
-              </w:rPr>
-              <w:t>Saved.</w:t>
-            </w:r>
-          </w:p>
-        </w:tc>
-      </w:tr>
-    </w:tbl>
-    <w:p/>
-    <w:p>
-      <w:pPr>
-        <w:ind w:left="432"/>
-      </w:pPr>
-      <w:r>
-        <w:rPr>
-          <w:b/>
-          <w:color w:val="196FC4"/>
-        </w:rPr>
-        <w:t xml:space="preserve">⚠️  Note: </w:t>
-      </w:r>
-      <w:r>
-        <w:rPr>
-          <w:i/>
-          <w:color w:val="404040"/>
-        </w:rPr>
-        <w:t>Enter q instead of a point number, or instead of a flow value, at any point to cancel and return to the menu without changing anything.</w:t>
-      </w:r>
-    </w:p>
-    <w:p/>
-    <w:p>
-      <w:pPr>
-        <w:pStyle w:val="Heading1"/>
-      </w:pPr>
-      <w:r>
-        <w:t>7.  Live Diagnostic Output</w:t>
-      </w:r>
-    </w:p>
-    <w:p>
-      <w:r>
-        <w:t>Options 5–8 each toggle a separate live telemetry stream on or off independently. Enabled streams print automatically, once every 500 ms, whenever the calibration menu is idle (i.e. not in the middle of a calibration step) — no further input is needed once a stream is switched on.</w:t>
-      </w:r>
-    </w:p>
-    <w:p>
-      <w:pPr>
-        <w:pStyle w:val="Heading2"/>
-      </w:pPr>
-      <w:r>
-        <w:t>7.1  Analog Output (Serial Plotter)</w:t>
-      </w:r>
-    </w:p>
-    <w:p>
-      <w:r>
-        <w:t>Type 5 and press Enter to toggle. Prints the raw analog reading, the interpolated dose, current GPS ground speed, and the resulting pump flow demand, formatted as Arduino Serial Plotter label:value pairs:</w:t>
-      </w:r>
-    </w:p>
-    <w:tbl>
-      <w:tblPr>
-        <w:tblStyle w:val="TableGrid"/>
-        <w:tblW w:type="auto" w:w="0"/>
-        <w:tblLook w:firstColumn="1" w:firstRow="1" w:lastColumn="0" w:lastRow="0" w:noHBand="0" w:noVBand="1" w:val="04A0"/>
-      </w:tblPr>
-      <w:tblGrid>
-        <w:gridCol w:w="9122"/>
-      </w:tblGrid>
-      <w:tr>
-        <w:tc>
-          <w:tcPr>
-            <w:tcW w:type="dxa" w:w="9122"/>
-            <w:shd w:val="clear" w:color="auto" w:fill="1E1E1E"/>
-          </w:tcPr>
-          <w:p>
-            <w:pPr>
-              <w:spacing w:before="0" w:after="0"/>
-            </w:pPr>
-            <w:r>
-              <w:rPr>
-                <w:rFonts w:ascii="Courier New" w:hAnsi="Courier New"/>
-                <w:color w:val="A8D8A8"/>
-                <w:sz w:val="18"/>
-              </w:rPr>
-              <w:t>raw:2031,dose:100.0,speed:1.85,flow:1550.0</w:t>
-            </w:r>
-          </w:p>
-        </w:tc>
-      </w:tr>
-    </w:tbl>
-    <w:p/>
-    <w:p>
-      <w:r>
-        <w:t>Open Tools ▸ Serial Plotter in the Arduino IDE (or the equivalent view in PlatformIO) at 115 200 baud to graph these four values live while turning the knob or driving — useful for sanity-checking the dose curve in the field without redoing the full calibration.</w:t>
-      </w:r>
-    </w:p>
-    <w:p>
-      <w:pPr>
-        <w:pStyle w:val="Heading2"/>
-      </w:pPr>
-      <w:r>
-        <w:t>7.2  Pump Output</w:t>
-      </w:r>
-    </w:p>
-    <w:p>
-      <w:r>
-        <w:t>Type 6 and press Enter to toggle. Prints calibration-mode state, the pump button state, whether the pump output is currently on, whether it’s being PWM-driven, and the raw value sent to the pump:</w:t>
-      </w:r>
-    </w:p>
-    <w:tbl>
-      <w:tblPr>
-        <w:tblStyle w:val="TableGrid"/>
-        <w:tblW w:type="auto" w:w="0"/>
-        <w:tblLook w:firstColumn="1" w:firstRow="1" w:lastColumn="0" w:lastRow="0" w:noHBand="0" w:noVBand="1" w:val="04A0"/>
-      </w:tblPr>
-      <w:tblGrid>
-        <w:gridCol w:w="9122"/>
-      </w:tblGrid>
-      <w:tr>
-        <w:tc>
-          <w:tcPr>
-            <w:tcW w:type="dxa" w:w="9122"/>
-            <w:shd w:val="clear" w:color="auto" w:fill="1E1E1E"/>
-          </w:tcPr>
-          <w:p>
-            <w:pPr>
-              <w:spacing w:before="0" w:after="0"/>
-            </w:pPr>
-            <w:r>
-              <w:rPr>
-                <w:rFonts w:ascii="Courier New" w:hAnsi="Courier New"/>
-                <w:color w:val="A8D8A8"/>
-                <w:sz w:val="18"/>
-              </w:rPr>
-              <w:t>calMode=N  pumpBtn=0  pumpOn=1  pumpPwmFlag=1  pumpVal=682</w:t>
-            </w:r>
-          </w:p>
-        </w:tc>
-      </w:tr>
-    </w:tbl>
-    <w:p/>
-    <w:p>
-      <w:r>
-        <w:t>Not formatted for the Serial Plotter — these are mostly discrete on/off flags, more useful read as text than graphed.</w:t>
-      </w:r>
-    </w:p>
-    <w:p>
-      <w:pPr>
-        <w:pStyle w:val="Heading2"/>
-      </w:pPr>
-      <w:r>
-        <w:t>7.3  GPS Output</w:t>
-      </w:r>
-    </w:p>
-    <w:p>
-      <w:r>
-        <w:t>Type 7 and press Enter to toggle. Prints ground speed, position, and the NMEA GGA fix-quality indicator (0 = no fix, 1 = GPS fix, 2 = DGPS fix, etc.):</w:t>
-      </w:r>
-    </w:p>
-    <w:tbl>
-      <w:tblPr>
-        <w:tblStyle w:val="TableGrid"/>
-        <w:tblW w:type="auto" w:w="0"/>
-        <w:tblLook w:firstColumn="1" w:firstRow="1" w:lastColumn="0" w:lastRow="0" w:noHBand="0" w:noVBand="1" w:val="04A0"/>
-      </w:tblPr>
-      <w:tblGrid>
-        <w:gridCol w:w="9122"/>
-      </w:tblGrid>
-      <w:tr>
-        <w:tc>
-          <w:tcPr>
-            <w:tcW w:type="dxa" w:w="9122"/>
-            <w:shd w:val="clear" w:color="auto" w:fill="1E1E1E"/>
-          </w:tcPr>
-          <w:p>
-            <w:pPr>
-              <w:spacing w:before="0" w:after="0"/>
-            </w:pPr>
-            <w:r>
-              <w:rPr>
-                <w:rFonts w:ascii="Courier New" w:hAnsi="Courier New"/>
-                <w:color w:val="A8D8A8"/>
-                <w:sz w:val="18"/>
-              </w:rPr>
-              <w:t>GPS: speed=1.85 m/s  lat=52.123456  lon=5.123456  quality=1</w:t>
-            </w:r>
-          </w:p>
-        </w:tc>
-      </w:tr>
-    </w:tbl>
-    <w:p/>
-    <w:p>
-      <w:pPr>
-        <w:pStyle w:val="Heading2"/>
-      </w:pPr>
-      <w:r>
-        <w:t>7.4  GPS Raw Passthrough</w:t>
-      </w:r>
-    </w:p>
-    <w:p>
-      <w:r>
-        <w:t>Type 8 and press Enter to toggle. Echoes the raw NMEA sentences received from the GPS receiver directly to the serial monitor — for low-level debugging of the GPS link itself, independent of the parsed output above.</w:t>
-      </w:r>
-    </w:p>
-    <w:p/>
-    <w:p>
-      <w:pPr>
-        <w:pStyle w:val="Heading1"/>
-      </w:pPr>
-      <w:r>
-        <w:t>8.  Verifying the Calibration</w:t>
+        <w:t>6.  Verifying the Calibration</w:t>
       </w:r>
     </w:p>
     <w:p>
@@ -2101,7 +1697,7 @@
                 <w:color w:val="A8D8A8"/>
                 <w:sz w:val="18"/>
               </w:rPr>
-              <w:t xml:space="preserve">  1: pwm=342   flow=850 ml/min</w:t>
+              <w:t xml:space="preserve">  1: pwm=342   flow=0.85 l/min</w:t>
             </w:r>
           </w:p>
           <w:p>
@@ -2114,7 +1710,7 @@
                 <w:color w:val="A8D8A8"/>
                 <w:sz w:val="18"/>
               </w:rPr>
-              <w:t xml:space="preserve">  2: pwm=512   flow=1200 ml/min</w:t>
+              <w:t xml:space="preserve">  2: pwm=512   flow=1.20 l/min</w:t>
             </w:r>
           </w:p>
           <w:p>
@@ -2127,7 +1723,7 @@
                 <w:color w:val="A8D8A8"/>
                 <w:sz w:val="18"/>
               </w:rPr>
-              <w:t xml:space="preserve">  3: pwm=682   flow=1550 ml/min</w:t>
+              <w:t xml:space="preserve">  3: pwm=682   flow=1.55 l/min</w:t>
             </w:r>
           </w:p>
           <w:p>
@@ -2140,7 +1736,7 @@
                 <w:color w:val="A8D8A8"/>
                 <w:sz w:val="18"/>
               </w:rPr>
-              <w:t xml:space="preserve">  4: pwm=852   flow=1820 ml/min</w:t>
+              <w:t xml:space="preserve">  4: pwm=852   flow=1.82 l/min</w:t>
             </w:r>
           </w:p>
           <w:p>
@@ -2153,7 +1749,7 @@
                 <w:color w:val="A8D8A8"/>
                 <w:sz w:val="18"/>
               </w:rPr>
-              <w:t xml:space="preserve">  5: pwm=1023  flow=2100 ml/min</w:t>
+              <w:t xml:space="preserve">  5: pwm=1023  flow=2.10 l/min</w:t>
             </w:r>
           </w:p>
         </w:tc>
@@ -2171,7 +1767,7 @@
         <w:pStyle w:val="Heading1"/>
       </w:pPr>
       <w:r>
-        <w:t>9.  Exiting Calibration</w:t>
+        <w:t>7.  Exiting Calibration</w:t>
       </w:r>
     </w:p>
     <w:p>

</xml_diff>

<commit_message>
Update Loofdoes calibration procedure documentation
Co-Authored-By: Claude Sonnet 5 <noreply@anthropic.com>
</commit_message>
<xml_diff>
--- a/Loofdoes Spuitcomputer/Documentation/Calibration_Procedure.docx
+++ b/Loofdoes Spuitcomputer/Documentation/Calibration_Procedure.docx
@@ -111,7 +111,7 @@
           </w:tcPr>
           <w:p>
             <w:r>
-              <w:t>Maps the pump PWM control value (0–1 023) to actual pump flow in l/min</w:t>
+              <w:t>Maps the pump PWM control value (0–1 023) to actual pump flow in ml/min</w:t>
             </w:r>
           </w:p>
         </w:tc>
@@ -218,7 +218,7 @@
                 <w:color w:val="A8D8A8"/>
                 <w:sz w:val="18"/>
               </w:rPr>
-              <w:t>1. Analog input  (l/ha)</w:t>
+              <w:t>1. Analog input    (l/ha)</w:t>
             </w:r>
           </w:p>
           <w:p>
@@ -231,7 +231,7 @@
                 <w:color w:val="A8D8A8"/>
                 <w:sz w:val="18"/>
               </w:rPr>
-              <w:t>2. PWM output    (l/min)</w:t>
+              <w:t>2. PWM output      (ml/min)</w:t>
             </w:r>
           </w:p>
           <w:p>
@@ -245,6 +245,71 @@
                 <w:sz w:val="18"/>
               </w:rPr>
               <w:t>3. Show current calibration</w:t>
+            </w:r>
+          </w:p>
+          <w:p>
+            <w:pPr>
+              <w:spacing w:before="0" w:after="0"/>
+            </w:pPr>
+            <w:r>
+              <w:rPr>
+                <w:rFonts w:ascii="Courier New" w:hAnsi="Courier New"/>
+                <w:color w:val="A8D8A8"/>
+                <w:sz w:val="18"/>
+              </w:rPr>
+              <w:t>4. Edit PWM point</w:t>
+            </w:r>
+          </w:p>
+          <w:p>
+            <w:pPr>
+              <w:spacing w:before="0" w:after="0"/>
+            </w:pPr>
+            <w:r>
+              <w:rPr>
+                <w:rFonts w:ascii="Courier New" w:hAnsi="Courier New"/>
+                <w:color w:val="A8D8A8"/>
+                <w:sz w:val="18"/>
+              </w:rPr>
+              <w:t>5. Analog output   (raw/dose/speed/flow) (OFF - press to toggle)</w:t>
+            </w:r>
+          </w:p>
+          <w:p>
+            <w:pPr>
+              <w:spacing w:before="0" w:after="0"/>
+            </w:pPr>
+            <w:r>
+              <w:rPr>
+                <w:rFonts w:ascii="Courier New" w:hAnsi="Courier New"/>
+                <w:color w:val="A8D8A8"/>
+                <w:sz w:val="18"/>
+              </w:rPr>
+              <w:t>6. Pump output     (calMode/pumpBtn/pumpOn/pumpVal) (OFF - press to toggle)</w:t>
+            </w:r>
+          </w:p>
+          <w:p>
+            <w:pPr>
+              <w:spacing w:before="0" w:after="0"/>
+            </w:pPr>
+            <w:r>
+              <w:rPr>
+                <w:rFonts w:ascii="Courier New" w:hAnsi="Courier New"/>
+                <w:color w:val="A8D8A8"/>
+                <w:sz w:val="18"/>
+              </w:rPr>
+              <w:t>7. GPS output      (OFF - press to toggle)</w:t>
+            </w:r>
+          </w:p>
+          <w:p>
+            <w:pPr>
+              <w:spacing w:before="0" w:after="0"/>
+            </w:pPr>
+            <w:r>
+              <w:rPr>
+                <w:rFonts w:ascii="Courier New" w:hAnsi="Courier New"/>
+                <w:color w:val="A8D8A8"/>
+                <w:sz w:val="18"/>
+              </w:rPr>
+              <w:t>8. GPS raw passthrough (OFF - press to toggle)</w:t>
             </w:r>
           </w:p>
           <w:p>
@@ -762,7 +827,7 @@
     </w:p>
     <w:p>
       <w:r>
-        <w:t>This procedure characterises the pump flow curve at five equally-spaced PWM control values. For each point the ESP32 runs the pump for exactly one minute; the volume collected in the bucket equals the flow in l/min.</w:t>
+        <w:t>This procedure characterises the pump flow curve at five equally-spaced PWM control values. For each point the ESP32 runs the pump for exactly one minute; the volume collected in the bucket equals the flow in ml/min.</w:t>
       </w:r>
     </w:p>
     <w:p>
@@ -1032,7 +1097,7 @@
     </w:p>
     <w:p>
       <w:r>
-        <w:t>The ESP32 now steps through the five PWM values one by one. For each point: place the bucket under the outlet and press Enter. The pump runs for exactly 60 seconds with a live countdown, then stops automatically. Measure the collected volume and enter it — the value is the flow in l/min.</w:t>
+        <w:t>The ESP32 now steps through the five PWM values one by one. For each point: place the bucket under the outlet and press Enter. The pump runs for exactly 60 seconds with a live countdown, then stops automatically. Measure the collected volume and enter it — the value is the flow in ml/min.</w:t>
       </w:r>
     </w:p>
     <w:tbl>
@@ -1151,7 +1216,7 @@
                 <w:color w:val="A8D8A8"/>
                 <w:sz w:val="18"/>
               </w:rPr>
-              <w:t>Run complete. Enter volume collected (l): 0.85</w:t>
+              <w:t>Run complete. Enter volume collected (ml): 850</w:t>
             </w:r>
           </w:p>
           <w:p>
@@ -1164,7 +1229,7 @@
                 <w:color w:val="A8D8A8"/>
                 <w:sz w:val="18"/>
               </w:rPr>
-              <w:t>Saved: PWM=342, flow=0.85 l/min.</w:t>
+              <w:t>Saved: PWM=342, flow=850 ml/min.</w:t>
             </w:r>
           </w:p>
           <w:p>
@@ -1242,7 +1307,7 @@
                 <w:color w:val="A8D8A8"/>
                 <w:sz w:val="18"/>
               </w:rPr>
-              <w:t>Run complete. Enter volume collected (l): 1.20</w:t>
+              <w:t>Run complete. Enter volume collected (ml): 1200</w:t>
             </w:r>
           </w:p>
           <w:p>
@@ -1255,7 +1320,7 @@
                 <w:color w:val="A8D8A8"/>
                 <w:sz w:val="18"/>
               </w:rPr>
-              <w:t>Saved: PWM=512, flow=1.20 l/min.</w:t>
+              <w:t>Saved: PWM=512, flow=1200 ml/min.</w:t>
             </w:r>
           </w:p>
           <w:p>
@@ -1333,7 +1398,7 @@
                 <w:color w:val="A8D8A8"/>
                 <w:sz w:val="18"/>
               </w:rPr>
-              <w:t>Run complete. Enter volume collected (l): 1.55</w:t>
+              <w:t>Run complete. Enter volume collected (ml): 1550</w:t>
             </w:r>
           </w:p>
           <w:p>
@@ -1346,7 +1411,7 @@
                 <w:color w:val="A8D8A8"/>
                 <w:sz w:val="18"/>
               </w:rPr>
-              <w:t>Saved: PWM=682, flow=1.55 l/min.</w:t>
+              <w:t>Saved: PWM=682, flow=1550 ml/min.</w:t>
             </w:r>
           </w:p>
           <w:p>
@@ -1424,7 +1489,7 @@
                 <w:color w:val="A8D8A8"/>
                 <w:sz w:val="18"/>
               </w:rPr>
-              <w:t>Run complete. Enter volume collected (l): 1.82</w:t>
+              <w:t>Run complete. Enter volume collected (ml): 1820</w:t>
             </w:r>
           </w:p>
           <w:p>
@@ -1437,7 +1502,7 @@
                 <w:color w:val="A8D8A8"/>
                 <w:sz w:val="18"/>
               </w:rPr>
-              <w:t>Saved: PWM=852, flow=1.82 l/min.</w:t>
+              <w:t>Saved: PWM=852, flow=1820 ml/min.</w:t>
             </w:r>
           </w:p>
           <w:p>
@@ -1515,7 +1580,7 @@
                 <w:color w:val="A8D8A8"/>
                 <w:sz w:val="18"/>
               </w:rPr>
-              <w:t>Run complete. Enter volume collected (l): 2.10</w:t>
+              <w:t>Run complete. Enter volume collected (ml): 2100</w:t>
             </w:r>
           </w:p>
           <w:p>
@@ -1528,7 +1593,7 @@
                 <w:color w:val="A8D8A8"/>
                 <w:sz w:val="18"/>
               </w:rPr>
-              <w:t>Saved: PWM=1023, flow=2.10 l/min.</w:t>
+              <w:t>Saved: PWM=1023, flow=2100 ml/min.</w:t>
             </w:r>
           </w:p>
           <w:p>
@@ -1586,7 +1651,346 @@
         <w:pStyle w:val="Heading1"/>
       </w:pPr>
       <w:r>
-        <w:t>6.  Verifying the Calibration</w:t>
+        <w:t>6.  Editing a PWM Point</w:t>
+      </w:r>
+    </w:p>
+    <w:p>
+      <w:r>
+        <w:t>Use this option to correct a single PWM calibration point (for example, a bad bucket reading) without repeating the entire five-point PWM run. The corrected value is written to NVS immediately.</w:t>
+      </w:r>
+    </w:p>
+    <w:p>
+      <w:pPr>
+        <w:pStyle w:val="ListNumber"/>
+      </w:pPr>
+      <w:r>
+        <w:t>Type 4 and press Enter.</w:t>
+      </w:r>
+    </w:p>
+    <w:p/>
+    <w:tbl>
+      <w:tblPr>
+        <w:tblStyle w:val="TableGrid"/>
+        <w:tblW w:type="auto" w:w="0"/>
+        <w:tblLook w:firstColumn="1" w:firstRow="1" w:lastColumn="0" w:lastRow="0" w:noHBand="0" w:noVBand="1" w:val="04A0"/>
+      </w:tblPr>
+      <w:tblGrid>
+        <w:gridCol w:w="9122"/>
+      </w:tblGrid>
+      <w:tr>
+        <w:tc>
+          <w:tcPr>
+            <w:tcW w:type="dxa" w:w="9122"/>
+            <w:shd w:val="clear" w:color="auto" w:fill="1E1E1E"/>
+          </w:tcPr>
+          <w:p>
+            <w:pPr>
+              <w:spacing w:before="0" w:after="0"/>
+            </w:pPr>
+            <w:r>
+              <w:rPr>
+                <w:rFonts w:ascii="Courier New" w:hAnsi="Courier New"/>
+                <w:color w:val="A8D8A8"/>
+                <w:sz w:val="18"/>
+              </w:rPr>
+              <w:t>=== CURRENT CALIBRATION ===</w:t>
+            </w:r>
+          </w:p>
+          <w:p>
+            <w:pPr>
+              <w:spacing w:before="0" w:after="0"/>
+            </w:pPr>
+            <w:r>
+              <w:rPr>
+                <w:rFonts w:ascii="Courier New" w:hAnsi="Courier New"/>
+                <w:color w:val="A8D8A8"/>
+                <w:sz w:val="18"/>
+              </w:rPr>
+              <w:t>...</w:t>
+            </w:r>
+          </w:p>
+          <w:p>
+            <w:pPr>
+              <w:spacing w:before="0" w:after="0"/>
+            </w:pPr>
+            <w:r>
+              <w:rPr>
+                <w:rFonts w:ascii="Courier New" w:hAnsi="Courier New"/>
+                <w:color w:val="A8D8A8"/>
+                <w:sz w:val="18"/>
+              </w:rPr>
+              <w:t>Select PWM point to edit (1-5, q to cancel): _</w:t>
+            </w:r>
+          </w:p>
+        </w:tc>
+      </w:tr>
+    </w:tbl>
+    <w:p/>
+    <w:p>
+      <w:pPr>
+        <w:pStyle w:val="ListNumber"/>
+      </w:pPr>
+      <w:r>
+        <w:t>Enter the number of the point to edit and press Enter. The current PWM and flow for that point are shown, then enter the corrected flow:</w:t>
+      </w:r>
+    </w:p>
+    <w:p/>
+    <w:tbl>
+      <w:tblPr>
+        <w:tblStyle w:val="TableGrid"/>
+        <w:tblW w:type="auto" w:w="0"/>
+        <w:tblLook w:firstColumn="1" w:firstRow="1" w:lastColumn="0" w:lastRow="0" w:noHBand="0" w:noVBand="1" w:val="04A0"/>
+      </w:tblPr>
+      <w:tblGrid>
+        <w:gridCol w:w="9122"/>
+      </w:tblGrid>
+      <w:tr>
+        <w:tc>
+          <w:tcPr>
+            <w:tcW w:type="dxa" w:w="9122"/>
+            <w:shd w:val="clear" w:color="auto" w:fill="1E1E1E"/>
+          </w:tcPr>
+          <w:p>
+            <w:pPr>
+              <w:spacing w:before="0" w:after="0"/>
+            </w:pPr>
+            <w:r>
+              <w:rPr>
+                <w:rFonts w:ascii="Courier New" w:hAnsi="Courier New"/>
+                <w:color w:val="A8D8A8"/>
+                <w:sz w:val="18"/>
+              </w:rPr>
+              <w:t>Point 3: PWM=682, flow=1550 ml/min</w:t>
+            </w:r>
+          </w:p>
+          <w:p>
+            <w:pPr>
+              <w:spacing w:before="0" w:after="0"/>
+            </w:pPr>
+            <w:r>
+              <w:rPr>
+                <w:rFonts w:ascii="Courier New" w:hAnsi="Courier New"/>
+                <w:color w:val="A8D8A8"/>
+                <w:sz w:val="18"/>
+              </w:rPr>
+              <w:t>New flow (1-4000 ml/min, q to cancel): 1600</w:t>
+            </w:r>
+          </w:p>
+          <w:p>
+            <w:pPr>
+              <w:spacing w:before="0" w:after="0"/>
+            </w:pPr>
+            <w:r>
+              <w:rPr>
+                <w:rFonts w:ascii="Courier New" w:hAnsi="Courier New"/>
+                <w:color w:val="A8D8A8"/>
+                <w:sz w:val="18"/>
+              </w:rPr>
+              <w:t>Saved.</w:t>
+            </w:r>
+          </w:p>
+        </w:tc>
+      </w:tr>
+    </w:tbl>
+    <w:p/>
+    <w:p>
+      <w:pPr>
+        <w:ind w:left="432"/>
+      </w:pPr>
+      <w:r>
+        <w:rPr>
+          <w:b/>
+          <w:color w:val="196FC4"/>
+        </w:rPr>
+        <w:t xml:space="preserve">⚠️  Note: </w:t>
+      </w:r>
+      <w:r>
+        <w:rPr>
+          <w:i/>
+          <w:color w:val="404040"/>
+        </w:rPr>
+        <w:t>Enter q instead of a point number, or instead of a flow value, at any point to cancel and return to the menu without changing anything.</w:t>
+      </w:r>
+    </w:p>
+    <w:p/>
+    <w:p>
+      <w:pPr>
+        <w:pStyle w:val="Heading1"/>
+      </w:pPr>
+      <w:r>
+        <w:t>7.  Live Diagnostic Output</w:t>
+      </w:r>
+    </w:p>
+    <w:p>
+      <w:r>
+        <w:t>Options 5–8 each toggle a separate live telemetry stream on or off independently. Enabled streams print automatically, once every 500 ms, whenever the calibration menu is idle (i.e. not in the middle of a calibration step) — no further input is needed once a stream is switched on.</w:t>
+      </w:r>
+    </w:p>
+    <w:p>
+      <w:pPr>
+        <w:pStyle w:val="Heading2"/>
+      </w:pPr>
+      <w:r>
+        <w:t>7.1  Analog Output (Serial Plotter)</w:t>
+      </w:r>
+    </w:p>
+    <w:p>
+      <w:r>
+        <w:t>Type 5 and press Enter to toggle. Prints the raw analog reading, the interpolated dose, current GPS ground speed, and the resulting pump flow demand, formatted as Arduino Serial Plotter label:value pairs:</w:t>
+      </w:r>
+    </w:p>
+    <w:tbl>
+      <w:tblPr>
+        <w:tblStyle w:val="TableGrid"/>
+        <w:tblW w:type="auto" w:w="0"/>
+        <w:tblLook w:firstColumn="1" w:firstRow="1" w:lastColumn="0" w:lastRow="0" w:noHBand="0" w:noVBand="1" w:val="04A0"/>
+      </w:tblPr>
+      <w:tblGrid>
+        <w:gridCol w:w="9122"/>
+      </w:tblGrid>
+      <w:tr>
+        <w:tc>
+          <w:tcPr>
+            <w:tcW w:type="dxa" w:w="9122"/>
+            <w:shd w:val="clear" w:color="auto" w:fill="1E1E1E"/>
+          </w:tcPr>
+          <w:p>
+            <w:pPr>
+              <w:spacing w:before="0" w:after="0"/>
+            </w:pPr>
+            <w:r>
+              <w:rPr>
+                <w:rFonts w:ascii="Courier New" w:hAnsi="Courier New"/>
+                <w:color w:val="A8D8A8"/>
+                <w:sz w:val="18"/>
+              </w:rPr>
+              <w:t>raw:2031,dose:100.0,speed:1.85,flow:1550.0</w:t>
+            </w:r>
+          </w:p>
+        </w:tc>
+      </w:tr>
+    </w:tbl>
+    <w:p/>
+    <w:p>
+      <w:r>
+        <w:t>Open Tools ▸ Serial Plotter in the Arduino IDE (or the equivalent view in PlatformIO) at 115 200 baud to graph these four values live while turning the knob or driving — useful for sanity-checking the dose curve in the field without redoing the full calibration.</w:t>
+      </w:r>
+    </w:p>
+    <w:p>
+      <w:pPr>
+        <w:pStyle w:val="Heading2"/>
+      </w:pPr>
+      <w:r>
+        <w:t>7.2  Pump Output</w:t>
+      </w:r>
+    </w:p>
+    <w:p>
+      <w:r>
+        <w:t>Type 6 and press Enter to toggle. Prints calibration-mode state, the pump button state, whether the pump output is currently on, whether it’s being PWM-driven, and the raw value sent to the pump:</w:t>
+      </w:r>
+    </w:p>
+    <w:tbl>
+      <w:tblPr>
+        <w:tblStyle w:val="TableGrid"/>
+        <w:tblW w:type="auto" w:w="0"/>
+        <w:tblLook w:firstColumn="1" w:firstRow="1" w:lastColumn="0" w:lastRow="0" w:noHBand="0" w:noVBand="1" w:val="04A0"/>
+      </w:tblPr>
+      <w:tblGrid>
+        <w:gridCol w:w="9122"/>
+      </w:tblGrid>
+      <w:tr>
+        <w:tc>
+          <w:tcPr>
+            <w:tcW w:type="dxa" w:w="9122"/>
+            <w:shd w:val="clear" w:color="auto" w:fill="1E1E1E"/>
+          </w:tcPr>
+          <w:p>
+            <w:pPr>
+              <w:spacing w:before="0" w:after="0"/>
+            </w:pPr>
+            <w:r>
+              <w:rPr>
+                <w:rFonts w:ascii="Courier New" w:hAnsi="Courier New"/>
+                <w:color w:val="A8D8A8"/>
+                <w:sz w:val="18"/>
+              </w:rPr>
+              <w:t>calMode=N  pumpBtn=0  pumpOn=1  pumpPwmFlag=1  pumpVal=682</w:t>
+            </w:r>
+          </w:p>
+        </w:tc>
+      </w:tr>
+    </w:tbl>
+    <w:p/>
+    <w:p>
+      <w:r>
+        <w:t>Not formatted for the Serial Plotter — these are mostly discrete on/off flags, more useful read as text than graphed.</w:t>
+      </w:r>
+    </w:p>
+    <w:p>
+      <w:pPr>
+        <w:pStyle w:val="Heading2"/>
+      </w:pPr>
+      <w:r>
+        <w:t>7.3  GPS Output</w:t>
+      </w:r>
+    </w:p>
+    <w:p>
+      <w:r>
+        <w:t>Type 7 and press Enter to toggle. Prints ground speed, position, and the NMEA GGA fix-quality indicator (0 = no fix, 1 = GPS fix, 2 = DGPS fix, etc.):</w:t>
+      </w:r>
+    </w:p>
+    <w:tbl>
+      <w:tblPr>
+        <w:tblStyle w:val="TableGrid"/>
+        <w:tblW w:type="auto" w:w="0"/>
+        <w:tblLook w:firstColumn="1" w:firstRow="1" w:lastColumn="0" w:lastRow="0" w:noHBand="0" w:noVBand="1" w:val="04A0"/>
+      </w:tblPr>
+      <w:tblGrid>
+        <w:gridCol w:w="9122"/>
+      </w:tblGrid>
+      <w:tr>
+        <w:tc>
+          <w:tcPr>
+            <w:tcW w:type="dxa" w:w="9122"/>
+            <w:shd w:val="clear" w:color="auto" w:fill="1E1E1E"/>
+          </w:tcPr>
+          <w:p>
+            <w:pPr>
+              <w:spacing w:before="0" w:after="0"/>
+            </w:pPr>
+            <w:r>
+              <w:rPr>
+                <w:rFonts w:ascii="Courier New" w:hAnsi="Courier New"/>
+                <w:color w:val="A8D8A8"/>
+                <w:sz w:val="18"/>
+              </w:rPr>
+              <w:t>GPS: speed=1.85 m/s  lat=52.123456  lon=5.123456  quality=1</w:t>
+            </w:r>
+          </w:p>
+        </w:tc>
+      </w:tr>
+    </w:tbl>
+    <w:p/>
+    <w:p>
+      <w:pPr>
+        <w:pStyle w:val="Heading2"/>
+      </w:pPr>
+      <w:r>
+        <w:t>7.4  GPS Raw Passthrough</w:t>
+      </w:r>
+    </w:p>
+    <w:p>
+      <w:r>
+        <w:t>Type 8 and press Enter to toggle. Echoes the raw NMEA sentences received from the GPS receiver directly to the serial monitor — for low-level debugging of the GPS link itself, independent of the parsed output above.</w:t>
+      </w:r>
+    </w:p>
+    <w:p/>
+    <w:p>
+      <w:pPr>
+        <w:pStyle w:val="Heading1"/>
+      </w:pPr>
+      <w:r>
+        <w:t>8.  Verifying the Calibration</w:t>
       </w:r>
     </w:p>
     <w:p>
@@ -1697,7 +2101,7 @@
                 <w:color w:val="A8D8A8"/>
                 <w:sz w:val="18"/>
               </w:rPr>
-              <w:t xml:space="preserve">  1: pwm=342   flow=0.85 l/min</w:t>
+              <w:t xml:space="preserve">  1: pwm=342   flow=850 ml/min</w:t>
             </w:r>
           </w:p>
           <w:p>
@@ -1710,7 +2114,7 @@
                 <w:color w:val="A8D8A8"/>
                 <w:sz w:val="18"/>
               </w:rPr>
-              <w:t xml:space="preserve">  2: pwm=512   flow=1.20 l/min</w:t>
+              <w:t xml:space="preserve">  2: pwm=512   flow=1200 ml/min</w:t>
             </w:r>
           </w:p>
           <w:p>
@@ -1723,7 +2127,7 @@
                 <w:color w:val="A8D8A8"/>
                 <w:sz w:val="18"/>
               </w:rPr>
-              <w:t xml:space="preserve">  3: pwm=682   flow=1.55 l/min</w:t>
+              <w:t xml:space="preserve">  3: pwm=682   flow=1550 ml/min</w:t>
             </w:r>
           </w:p>
           <w:p>
@@ -1736,7 +2140,7 @@
                 <w:color w:val="A8D8A8"/>
                 <w:sz w:val="18"/>
               </w:rPr>
-              <w:t xml:space="preserve">  4: pwm=852   flow=1.82 l/min</w:t>
+              <w:t xml:space="preserve">  4: pwm=852   flow=1820 ml/min</w:t>
             </w:r>
           </w:p>
           <w:p>
@@ -1749,7 +2153,7 @@
                 <w:color w:val="A8D8A8"/>
                 <w:sz w:val="18"/>
               </w:rPr>
-              <w:t xml:space="preserve">  5: pwm=1023  flow=2.10 l/min</w:t>
+              <w:t xml:space="preserve">  5: pwm=1023  flow=2100 ml/min</w:t>
             </w:r>
           </w:p>
         </w:tc>
@@ -1767,7 +2171,7 @@
         <w:pStyle w:val="Heading1"/>
       </w:pPr>
       <w:r>
-        <w:t>7.  Exiting Calibration</w:t>
+        <w:t>9.  Exiting Calibration</w:t>
       </w:r>
     </w:p>
     <w:p>

</xml_diff>